<commit_message>
docs: commit single-source-of-truth reorg (archive to docs/_archive, Drive is canonical) + recent Code prompts
Co-Authored-By: Claude Sonnet 4.6 <noreply@anthropic.com>
</commit_message>
<xml_diff>
--- a/docs/testing/llv_platform_test_plan.docx
+++ b/docs/testing/llv_platform_test_plan.docx
@@ -42,7 +42,7 @@
         <w:pStyle w:val="BodyText"/>
       </w:pPr>
       <w:r>
-        <w:t xml:space="preserve">Test Environment: localhost + Supabase local + Stripe sandbox (Lion Gate Technology)</w:t>
+        <w:t>Test Environment: Vercel deployment (luxury-lifestyle-vault.vercel.app) + hosted Supabase + Stripe sandbox (test mode). | Test run: June 1, 2026 (Cowork, browser-driven).</w:t>
       </w:r>
     </w:p>
     <w:p>
@@ -20956,155 +20956,335 @@
       </w:tr>
       <w:tr>
         <w:tc>
-          <w:p/>
-        </w:tc>
-        <w:tc>
-          <w:p/>
-        </w:tc>
-        <w:tc>
-          <w:p/>
-        </w:tc>
-        <w:tc>
-          <w:p/>
-        </w:tc>
-        <w:tc>
-          <w:p/>
-        </w:tc>
-      </w:tr>
-      <w:tr>
-        <w:tc>
-          <w:p/>
-        </w:tc>
-        <w:tc>
-          <w:p/>
-        </w:tc>
-        <w:tc>
-          <w:p/>
-        </w:tc>
-        <w:tc>
-          <w:p/>
-        </w:tc>
-        <w:tc>
-          <w:p/>
-        </w:tc>
-      </w:tr>
-      <w:tr>
-        <w:tc>
-          <w:p/>
-        </w:tc>
-        <w:tc>
-          <w:p/>
-        </w:tc>
-        <w:tc>
-          <w:p/>
-        </w:tc>
-        <w:tc>
-          <w:p/>
-        </w:tc>
-        <w:tc>
-          <w:p/>
-        </w:tc>
-      </w:tr>
-      <w:tr>
-        <w:tc>
-          <w:p/>
-        </w:tc>
-        <w:tc>
-          <w:p/>
-        </w:tc>
-        <w:tc>
-          <w:p/>
-        </w:tc>
-        <w:tc>
-          <w:p/>
-        </w:tc>
-        <w:tc>
-          <w:p/>
-        </w:tc>
-      </w:tr>
-      <w:tr>
-        <w:tc>
-          <w:p/>
-        </w:tc>
-        <w:tc>
-          <w:p/>
-        </w:tc>
-        <w:tc>
-          <w:p/>
-        </w:tc>
-        <w:tc>
-          <w:p/>
-        </w:tc>
-        <w:tc>
-          <w:p/>
-        </w:tc>
-      </w:tr>
-      <w:tr>
-        <w:tc>
-          <w:p/>
-        </w:tc>
-        <w:tc>
-          <w:p/>
-        </w:tc>
-        <w:tc>
-          <w:p/>
-        </w:tc>
-        <w:tc>
-          <w:p/>
-        </w:tc>
-        <w:tc>
-          <w:p/>
-        </w:tc>
-      </w:tr>
-      <w:tr>
-        <w:tc>
-          <w:p/>
-        </w:tc>
-        <w:tc>
-          <w:p/>
-        </w:tc>
-        <w:tc>
-          <w:p/>
-        </w:tc>
-        <w:tc>
-          <w:p/>
-        </w:tc>
-        <w:tc>
-          <w:p/>
-        </w:tc>
-      </w:tr>
-      <w:tr>
-        <w:tc>
-          <w:p/>
-        </w:tc>
-        <w:tc>
-          <w:p/>
-        </w:tc>
-        <w:tc>
-          <w:p/>
-        </w:tc>
-        <w:tc>
-          <w:p/>
-        </w:tc>
-        <w:tc>
-          <w:p/>
-        </w:tc>
-      </w:tr>
-      <w:tr>
-        <w:tc>
-          <w:p/>
-        </w:tc>
-        <w:tc>
-          <w:p/>
-        </w:tc>
-        <w:tc>
-          <w:p/>
-        </w:tc>
-        <w:tc>
-          <w:p/>
-        </w:tc>
-        <w:tc>
-          <w:p/>
+          <w:p>
+            <w:r>
+              <w:t>T2.1</w:t>
+            </w:r>
+          </w:p>
+        </w:tc>
+        <w:tc>
+          <w:p>
+            <w:r>
+              <w:t>High</w:t>
+            </w:r>
+          </w:p>
+        </w:tc>
+        <w:tc>
+          <w:p>
+            <w:r>
+              <w:t>"Save pricing" never persists a price change and the page appears frozen. ROOT CAUSE: tier-edit-form.tsx gates the save on a native window.confirm() that blocks the page; when dismissed, the handler returns early. Not a Stripe hang. The no-confirm "Save configuration" button saves instantly.</w:t>
+            </w:r>
+          </w:p>
+        </w:tc>
+        <w:tc>
+          <w:p>
+            <w:r>
+              <w:t>Expected: price saves + change log + audit + Stripe sync. Actual: native confirm() blocks/cancels the save; price stays $299, no audit entry. Part of the native-dialog issue (#9).</w:t>
+            </w:r>
+          </w:p>
+        </w:tc>
+        <w:tc>
+          <w:p>
+            <w:r>
+              <w:t>OPEN — fix in native-dialogs Code prompt</w:t>
+            </w:r>
+          </w:p>
+        </w:tc>
+      </w:tr>
+      <w:tr>
+        <w:tc>
+          <w:p>
+            <w:r>
+              <w:t>T6.4</w:t>
+            </w:r>
+          </w:p>
+        </w:tc>
+        <w:tc>
+          <w:p>
+            <w:r>
+              <w:t>High</w:t>
+            </w:r>
+          </w:p>
+        </w:tc>
+        <w:tc>
+          <w:p>
+            <w:r>
+              <w:t>Admin Concierge Queue (/admin/concierge) shows zero messages under every status/source filter, though the dashboard tile counts "3 open" and client-side concierge threads exist.</w:t>
+            </w:r>
+          </w:p>
+        </w:tc>
+        <w:tc>
+          <w:p>
+            <w:r>
+              <w:t>Expected: open messages listed and manageable. Actual: empty queue; founder cannot read/respond. Data exists (dashboard count + client threads). Likely query/display bug; provider messages have null author (see Sec 7).</w:t>
+            </w:r>
+          </w:p>
+        </w:tc>
+        <w:tc>
+          <w:p>
+            <w:r>
+              <w:t>OPEN — Code prompt written</w:t>
+            </w:r>
+          </w:p>
+        </w:tc>
+      </w:tr>
+      <w:tr>
+        <w:tc>
+          <w:p>
+            <w:r>
+              <w:t>T4.2</w:t>
+            </w:r>
+          </w:p>
+        </w:tc>
+        <w:tc>
+          <w:p>
+            <w:r>
+              <w:t>High (config)</w:t>
+            </w:r>
+          </w:p>
+        </w:tc>
+        <w:tc>
+          <w:p>
+            <w:r>
+              <w:t>AI semantic search unavailable on Vercel — toast "AI search unavailable — showing best-effort matches". Keyword fallback works ("tuxedo"-&gt;4 results); natural-language ("black tie outfit for a December gala")-&gt;0.</w:t>
+            </w:r>
+          </w:p>
+        </w:tc>
+        <w:tc>
+          <w:p>
+            <w:r>
+              <w:t>Expected: Haiku-ranked semantic results. Actual: AI layer down — almost certainly missing ANTHROPIC_API_KEY env var on Vercel. Graceful fallback OK (no crash).</w:t>
+            </w:r>
+          </w:p>
+        </w:tc>
+        <w:tc>
+          <w:p>
+            <w:r>
+              <w:t>OPEN — config fix (set env var + redeploy)</w:t>
+            </w:r>
+          </w:p>
+        </w:tc>
+      </w:tr>
+      <w:tr>
+        <w:tc>
+          <w:p>
+            <w:r>
+              <w:t>Sec 7</w:t>
+            </w:r>
+          </w:p>
+        </w:tc>
+        <w:tc>
+          <w:p>
+            <w:r>
+              <w:t>High</w:t>
+            </w:r>
+          </w:p>
+        </w:tc>
+        <w:tc>
+          <w:p>
+            <w:r>
+              <w:t>Provider portal unreachable. seedProviders() inserts only providers-table rows — no provider auth user/profile, providers.profile_id is null. No provider entry in quick-login; /provider role-gates all non-providers out.</w:t>
+            </w:r>
+          </w:p>
+        </w:tc>
+        <w:tc>
+          <w:p>
+            <w:r>
+              <w:t>Expected: provider login -&gt; portal order queue. Actual: no provider account exists; T7.1-T7.4 untestable. Also breaks provider concierge-message attribution.</w:t>
+            </w:r>
+          </w:p>
+        </w:tc>
+        <w:tc>
+          <w:p>
+            <w:r>
+              <w:t>OPEN — Code prompt written</w:t>
+            </w:r>
+          </w:p>
+        </w:tc>
+      </w:tr>
+      <w:tr>
+        <w:tc>
+          <w:p>
+            <w:r>
+              <w:t>T2.2</w:t>
+            </w:r>
+          </w:p>
+        </w:tc>
+        <w:tc>
+          <w:p>
+            <w:r>
+              <w:t>Low</w:t>
+            </w:r>
+          </w:p>
+        </w:tc>
+        <w:tc>
+          <w:p>
+            <w:r>
+              <w:t>New Corridor modal prefilled origin/destination code defaults ("WI"/"AZ") are not registered in form state.</w:t>
+            </w:r>
+          </w:p>
+        </w:tc>
+        <w:tc>
+          <w:p>
+            <w:r>
+              <w:t>Expected: submit with prefilled defaults works. Actual: "All fields are required" error until codes are retyped.</w:t>
+            </w:r>
+          </w:p>
+        </w:tc>
+        <w:tc>
+          <w:p>
+            <w:r>
+              <w:t>OPEN</w:t>
+            </w:r>
+          </w:p>
+        </w:tc>
+      </w:tr>
+      <w:tr>
+        <w:tc>
+          <w:p>
+            <w:r>
+              <w:t>T4.4</w:t>
+            </w:r>
+          </w:p>
+        </w:tc>
+        <w:tc>
+          <w:p>
+            <w:r>
+              <w:t>Low</w:t>
+            </w:r>
+          </w:p>
+        </w:tc>
+        <w:tc>
+          <w:p>
+            <w:r>
+              <w:t>Outfit delete shows a spurious "Failed to delete outfit" error toast even though the delete succeeds.</w:t>
+            </w:r>
+          </w:p>
+        </w:tc>
+        <w:tc>
+          <w:p>
+            <w:r>
+              <w:t>Expected: success confirmation. Actual: red error toast; outfit is actually removed (confirmed after reload).</w:t>
+            </w:r>
+          </w:p>
+        </w:tc>
+        <w:tc>
+          <w:p>
+            <w:r>
+              <w:t>OPEN</w:t>
+            </w:r>
+          </w:p>
+        </w:tc>
+      </w:tr>
+      <w:tr>
+        <w:tc>
+          <w:p>
+            <w:r>
+              <w:t>T5.1/T5.2/T6.2</w:t>
+            </w:r>
+          </w:p>
+        </w:tc>
+        <w:tc>
+          <w:p>
+            <w:r>
+              <w:t>Low</w:t>
+            </w:r>
+          </w:p>
+        </w:tc>
+        <w:tc>
+          <w:p>
+            <w:r>
+              <w:t>Requested-delivery date displays one day earlier on mid-flow review/details/dispatch-modal screens (entered 06/06 shows 'June 5'). Final saved order shows the correct date.</w:t>
+            </w:r>
+          </w:p>
+        </w:tc>
+        <w:tc>
+          <w:p>
+            <w:r>
+              <w:t>Expected: consistent date. Actual: off-by-one on review displays (timezone/UTC parsing); also feeds the provider deadline default.</w:t>
+            </w:r>
+          </w:p>
+        </w:tc>
+        <w:tc>
+          <w:p>
+            <w:r>
+              <w:t>OPEN</w:t>
+            </w:r>
+          </w:p>
+        </w:tc>
+      </w:tr>
+      <w:tr>
+        <w:tc>
+          <w:p>
+            <w:r>
+              <w:t>T9.1</w:t>
+            </w:r>
+          </w:p>
+        </w:tc>
+        <w:tc>
+          <w:p>
+            <w:r>
+              <w:t>Low</w:t>
+            </w:r>
+          </w:p>
+        </w:tc>
+        <w:tc>
+          <w:p>
+            <w:r>
+              <w:t>Notification bell badge not reactive after "Mark all read" — stays at the prior count until a page reload. Single-notification reads do update the bell.</w:t>
+            </w:r>
+          </w:p>
+        </w:tc>
+        <w:tc>
+          <w:p>
+            <w:r>
+              <w:t>Expected: bell count -&gt; 0 immediately. Actual: stale until reload (mark-all-read does persist server-side).</w:t>
+            </w:r>
+          </w:p>
+        </w:tc>
+        <w:tc>
+          <w:p>
+            <w:r>
+              <w:t>OPEN</w:t>
+            </w:r>
+          </w:p>
+        </w:tc>
+      </w:tr>
+      <w:tr>
+        <w:tc>
+          <w:p>
+            <w:r>
+              <w:t>Cross-cutting</w:t>
+            </w:r>
+          </w:p>
+        </w:tc>
+        <w:tc>
+          <w:p>
+            <w:r>
+              <w:t>High</w:t>
+            </w:r>
+          </w:p>
+        </w:tc>
+        <w:tc>
+          <w:p>
+            <w:r>
+              <w:t>Native window.confirm() used at 8 sites (tier save-pricing + deactivate; order refund + mark-return-received; client cancel-order + initiate-return; sign-out-everywhere; close-account) instead of a custom dialog. Off-brand browser chrome and blocks the main thread.</w:t>
+            </w:r>
+          </w:p>
+        </w:tc>
+        <w:tc>
+          <w:p>
+            <w:r>
+              <w:t>Expected: custom in-app confirm dialog (Obsidian &amp; Ivory). Actual: native "luxury-lifestyle-vault.vercel.app says…" OS dialog (founder screenshot on Cancel order). Root cause of the Save-pricing freeze (bug #1).</w:t>
+            </w:r>
+          </w:p>
+        </w:tc>
+        <w:tc>
+          <w:p>
+            <w:r>
+              <w:t>OPEN — Code prompt llv_code_prompt_2026-06-01_native_dialogs.md</w:t>
+            </w:r>
+          </w:p>
         </w:tc>
       </w:tr>
       <w:tr>

</xml_diff>